<commit_message>
update data templateing docx
</commit_message>
<xml_diff>
--- a/assets/template/doc/setda/SPT_SETDA.docx
+++ b/assets/template/doc/setda/SPT_SETDA.docx
@@ -340,6 +340,12 @@
           <w:rFonts w:ascii="Arial" w:hAnsi="Arial" w:cs="Arial"/>
         </w:rPr>
         <w:t>letter_code</w:t>
+      </w:r>
+      <w:r>
+        <w:rPr>
+          <w:rFonts w:ascii="Arial" w:hAnsi="Arial" w:cs="Arial"/>
+        </w:rPr>
+        <w:t>_spt</w:t>
       </w:r>
       <w:proofErr w:type="spellEnd"/>
       <w:r>

</xml_diff>